<commit_message>
Made significant changes and closing on end output
</commit_message>
<xml_diff>
--- a/outputs/cam/CAM_Vizag_Steel_2026-03-07.docx
+++ b/outputs/cam/CAM_Vizag_Steel_2026-03-07.docx
@@ -123,7 +123,7 @@
         <w:rPr>
           <w:b/>
         </w:rPr>
-        <w:t>Recommendation: APPROVE | Amount: ₹28.72 crore | Rate: 9.50% p.a.</w:t>
+        <w:t>Recommendation: APPROVE | Amount: ₹28.06 crore | Rate: 9.50% p.a.</w:t>
       </w:r>
     </w:p>
     <w:p>
@@ -164,12 +164,12 @@
     </w:p>
     <w:p>
       <w:r>
-        <w:t>Primary respondent: Sandeep kumar (Finance Officer)</w:t>
+        <w:t>Primary respondent: Not provided by borrower.</w:t>
       </w:r>
     </w:p>
     <w:p>
       <w:r>
-        <w:t>Business highlights: Ntg</w:t>
+        <w:t>Business highlights: No additional borrower business highlights submitted.</w:t>
       </w:r>
     </w:p>
     <w:p>
@@ -179,7 +179,7 @@
     </w:p>
     <w:p>
       <w:r>
-        <w:t>Declared capacity utilization: 70.0%</w:t>
+        <w:t>Declared capacity utilization: 65.0%</w:t>
       </w:r>
     </w:p>
     <w:p>
@@ -213,7 +213,7 @@
     </w:p>
     <w:p>
       <w:r>
-        <w:t>Score: 5.5/10 | Risk Level: MEDIUM</w:t>
+        <w:t>Score: 5.25/10 | Risk Level: MEDIUM</w:t>
       </w:r>
     </w:p>
     <w:p>
@@ -469,7 +469,7 @@
           </w:tcPr>
           <w:p>
             <w:r>
-              <w:t>Has Going Concern Doubt weakens credit quality (impact -1.178).</w:t>
+              <w:t>Has Nclt Proceedings weakens credit quality (impact -1.152).</w:t>
             </w:r>
           </w:p>
         </w:tc>
@@ -501,7 +501,7 @@
           </w:tcPr>
           <w:p>
             <w:r>
-              <w:t>Has Nclt Proceedings weakens credit quality (impact -1.123).</w:t>
+              <w:t>Has Going Concern Doubt weakens credit quality (impact -1.121).</w:t>
             </w:r>
           </w:p>
         </w:tc>
@@ -533,7 +533,7 @@
           </w:tcPr>
           <w:p>
             <w:r>
-              <w:t>Has Promoter Fraud News weakens credit quality (impact -0.497).</w:t>
+              <w:t>Has Promoter Fraud News weakens credit quality (impact -0.514).</w:t>
             </w:r>
           </w:p>
         </w:tc>
@@ -577,7 +577,7 @@
         <w:t>**Section 6 — Research Findings**</w:t>
         <w:br/>
         <w:br/>
-        <w:t>This section details the findings from our comprehensive due diligence conducted on Vizag Steel, informing the overall credit appraisal and risk assessment. Based on the aggregated research, the company is assessed as LOW</w:t>
+        <w:t>Our comprehensive research into Vizag Steel's operational and external environment corroborates a low-risk profile for the proposed credit facility. The findings collectively contribute positively to the overall credit risk assessment, resulting</w:t>
       </w:r>
     </w:p>
     <w:p/>
@@ -606,11 +606,6 @@
     </w:p>
     <w:p>
       <w:r>
-        <w:t>[Severity.INFORMATIONAL] Economic Times (Mock): Promoter received an MSME export award in 2024.</w:t>
-      </w:r>
-    </w:p>
-    <w:p>
-      <w:r>
         <w:t>[Severity.LOW] Regulatory Intel: No direct RBI/SEBI enforcement action found in sampled sources.</w:t>
       </w:r>
     </w:p>
@@ -624,7 +619,7 @@
     </w:p>
     <w:p>
       <w:r>
-        <w:t>Final credit score: 835.06/900</w:t>
+        <w:t>Final credit score: 827.41/900</w:t>
       </w:r>
     </w:p>
     <w:p>
@@ -634,7 +629,7 @@
     </w:p>
     <w:p>
       <w:r>
-        <w:t>Recommended loan amount: ₹28.72 crore</w:t>
+        <w:t>Recommended loan amount: ₹28.06 crore</w:t>
       </w:r>
     </w:p>
     <w:p>
@@ -654,22 +649,12 @@
     </w:p>
     <w:p>
       <w:r>
-        <w:t>Borrower interaction adjustment applied in scoring: +3.0</w:t>
-      </w:r>
-    </w:p>
-    <w:p>
-      <w:r>
-        <w:t>Net score impact from human/borrower input: +9.0 points</w:t>
-      </w:r>
-    </w:p>
-    <w:p>
-      <w:r>
         <w:t>AI Explainability Note:</w:t>
       </w:r>
     </w:p>
     <w:p>
       <w:r>
-        <w:t>The recommendation balances cashflow resilience against detected governance and compliance risks. DSCR is observed at 0.00x, GST ITC gap at 0.00%, and factory utilization at 70.0%. Positive drivers include: Dscr supports credit quality (impact +0.441).; Ebitda Margin supports credit quality (impact +0.377).; Average Bank Balance To Limit Ratio supports credit quality (impact +0.241). Key constraints include: Has Going Concern Doubt weakens credit quality (impact -1.178).; Has Nclt Proceedings weakens credit quality (impact -1.123).; Has Promoter Fraud News weakens credit quality (impact -0.497). Final recommendation therefore applies risk-adjusted exposure and pricing.</w:t>
+        <w:t>The recommendation balances cashflow resilience against detected governance and compliance risks. DSCR is observed at 0.00x, GST ITC gap at 0.00%, and factory utilization at 65.0%. Positive drivers include: Dscr supports credit quality (impact +0.449).; Ebitda Margin supports credit quality (impact +0.378).; Average Bank Balance To Limit Ratio supports credit quality (impact +0.241). Key constraints include: Has Nclt Proceedings weakens credit quality (impact -1.152).; Has Going Concern Doubt weakens credit quality (impact -1.121).; Has Promoter Fraud News weakens credit quality (impact -0.514). Final recommendation therefore applies risk-adjusted exposure and pricing.</w:t>
       </w:r>
     </w:p>
     <w:p>
@@ -730,11 +715,6 @@
     </w:p>
     <w:p>
       <w:r>
-        <w:t>- https://news.example/promoter-award</w:t>
-      </w:r>
-    </w:p>
-    <w:p>
-      <w:r>
         <w:t>- https://www.rbi.org.in/</w:t>
       </w:r>
     </w:p>
@@ -745,7 +725,7 @@
     </w:p>
     <w:p>
       <w:r>
-        <w:t>SHAP top factors: has_going_concern_doubt, has_nclt_proceedings, has_promoter_fraud_news, dscr, ebitda_margin, average_bank_balance_to_limit_ratio, gstr3b_vs_2a_itc_gap, gst_return_filing_consistency, collateral_type_score, factory_capacity_utilization</w:t>
+        <w:t>SHAP top factors: has_nclt_proceedings, has_going_concern_doubt, has_promoter_fraud_news, dscr, ebitda_margin, average_bank_balance_to_limit_ratio, gstr3b_vs_2a_itc_gap, gst_return_filing_consistency, collateral_type_score, factory_capacity_utilization</w:t>
       </w:r>
     </w:p>
     <w:p>
@@ -770,17 +750,17 @@
     </w:p>
     <w:p>
       <w:r>
-        <w:t>Total web-research findings considered: 5</w:t>
+        <w:t>Total web-research findings considered: 4</w:t>
       </w:r>
     </w:p>
     <w:p>
       <w:r>
-        <w:t>Human-in-the-loop adjustment from due diligence: +3.0</w:t>
+        <w:t>Human-in-the-loop adjustment from due diligence: +0.0</w:t>
       </w:r>
     </w:p>
     <w:p>
       <w:r>
-        <w:t>Final decision score delta from human input: +9.0 points</w:t>
+        <w:t>Final decision score delta from human input: +0.0 points</w:t>
       </w:r>
     </w:p>
     <w:sectPr>

</xml_diff>